<commit_message>
Actualización de informe de proyecto
</commit_message>
<xml_diff>
--- a/CIB302_Actividad_Formativa_Semana 5.docx
+++ b/CIB302_Actividad_Formativa_Semana 5.docx
@@ -1,6 +1,6 @@
 
 <file path=word/document.xml><?xml version="1.0" encoding="utf-8"?>
-<w:document xmlns:wpc="http://schemas.microsoft.com/office/word/2010/wordprocessingCanvas" xmlns:cx="http://schemas.microsoft.com/office/drawing/2014/chartex" xmlns:cx1="http://schemas.microsoft.com/office/drawing/2015/9/8/chartex" xmlns:cx2="http://schemas.microsoft.com/office/drawing/2015/10/21/chartex" xmlns:cx3="http://schemas.microsoft.com/office/drawing/2016/5/9/chartex" xmlns:cx4="http://schemas.microsoft.com/office/drawing/2016/5/10/chartex" xmlns:cx5="http://schemas.microsoft.com/office/drawing/2016/5/11/chartex" xmlns:cx6="http://schemas.microsoft.com/office/drawing/2016/5/12/chartex" xmlns:cx7="http://schemas.microsoft.com/office/drawing/2016/5/13/chartex" xmlns:cx8="http://schemas.microsoft.com/office/drawing/2016/5/14/chartex" xmlns:mc="http://schemas.openxmlformats.org/markup-compatibility/2006" xmlns:aink="http://schemas.microsoft.com/office/drawing/2016/ink" xmlns:am3d="http://schemas.microsoft.com/office/drawing/2017/model3d" xmlns:o="urn:schemas-microsoft-com:office:office" xmlns:r="http://schemas.openxmlformats.org/officeDocument/2006/relationships" xmlns:m="http://schemas.openxmlformats.org/officeDocument/2006/math" xmlns:v="urn:schemas-microsoft-com:vml" xmlns:wp14="http://schemas.microsoft.com/office/word/2010/wordprocessingDrawing" xmlns:wp="http://schemas.openxmlformats.org/drawingml/2006/wordprocessingDrawing" xmlns:w10="urn:schemas-microsoft-com:office:word" xmlns:w="http://schemas.openxmlformats.org/wordprocessingml/2006/main" xmlns:w14="http://schemas.microsoft.com/office/word/2010/wordml" xmlns:w15="http://schemas.microsoft.com/office/word/2012/wordml" xmlns:w16cid="http://schemas.microsoft.com/office/word/2016/wordml/cid" xmlns:w16se="http://schemas.microsoft.com/office/word/2015/wordml/symex" xmlns:wpg="http://schemas.microsoft.com/office/word/2010/wordprocessingGroup" xmlns:wpi="http://schemas.microsoft.com/office/word/2010/wordprocessingInk" xmlns:wne="http://schemas.microsoft.com/office/word/2006/wordml" xmlns:wps="http://schemas.microsoft.com/office/word/2010/wordprocessingShape" mc:Ignorable="w14 w15 w16se w16cid wp14">
+<w:document xmlns:wpc="http://schemas.microsoft.com/office/word/2010/wordprocessingCanvas" xmlns:cx="http://schemas.microsoft.com/office/drawing/2014/chartex" xmlns:cx1="http://schemas.microsoft.com/office/drawing/2015/9/8/chartex" xmlns:cx2="http://schemas.microsoft.com/office/drawing/2015/10/21/chartex" xmlns:cx3="http://schemas.microsoft.com/office/drawing/2016/5/9/chartex" xmlns:cx4="http://schemas.microsoft.com/office/drawing/2016/5/10/chartex" xmlns:cx5="http://schemas.microsoft.com/office/drawing/2016/5/11/chartex" xmlns:cx6="http://schemas.microsoft.com/office/drawing/2016/5/12/chartex" xmlns:cx7="http://schemas.microsoft.com/office/drawing/2016/5/13/chartex" xmlns:cx8="http://schemas.microsoft.com/office/drawing/2016/5/14/chartex" xmlns:mc="http://schemas.openxmlformats.org/markup-compatibility/2006" xmlns:aink="http://schemas.microsoft.com/office/drawing/2016/ink" xmlns:am3d="http://schemas.microsoft.com/office/drawing/2017/model3d" xmlns:o="urn:schemas-microsoft-com:office:office" xmlns:oel="http://schemas.microsoft.com/office/2019/extlst" xmlns:r="http://schemas.openxmlformats.org/officeDocument/2006/relationships" xmlns:m="http://schemas.openxmlformats.org/officeDocument/2006/math" xmlns:v="urn:schemas-microsoft-com:vml" xmlns:wp14="http://schemas.microsoft.com/office/word/2010/wordprocessingDrawing" xmlns:wp="http://schemas.openxmlformats.org/drawingml/2006/wordprocessingDrawing" xmlns:w10="urn:schemas-microsoft-com:office:word" xmlns:w="http://schemas.openxmlformats.org/wordprocessingml/2006/main" xmlns:w14="http://schemas.microsoft.com/office/word/2010/wordml" xmlns:w15="http://schemas.microsoft.com/office/word/2012/wordml" xmlns:w16cex="http://schemas.microsoft.com/office/word/2018/wordml/cex" xmlns:w16cid="http://schemas.microsoft.com/office/word/2016/wordml/cid" xmlns:w16="http://schemas.microsoft.com/office/word/2018/wordml" xmlns:w16du="http://schemas.microsoft.com/office/word/2023/wordml/word16du" xmlns:w16sdtdh="http://schemas.microsoft.com/office/word/2020/wordml/sdtdatahash" xmlns:w16sdtfl="http://schemas.microsoft.com/office/word/2024/wordml/sdtformatlock" xmlns:w16se="http://schemas.microsoft.com/office/word/2015/wordml/symex" xmlns:wpg="http://schemas.microsoft.com/office/word/2010/wordprocessingGroup" xmlns:wpi="http://schemas.microsoft.com/office/word/2010/wordprocessingInk" xmlns:wne="http://schemas.microsoft.com/office/word/2006/wordml" xmlns:wps="http://schemas.microsoft.com/office/word/2010/wordprocessingShape" mc:Ignorable="w14 w15 w16se w16cid w16 w16cex w16sdtdh w16sdtfl w16du wp14">
   <w:body>
     <w:p>
       <w:pPr>
@@ -14,7 +14,7 @@
           <w:lang w:val="es-ES_tradnl"/>
         </w:rPr>
         <w:drawing>
-          <wp:anchor distT="0" distB="0" distL="114300" distR="114300" simplePos="0" relativeHeight="251658240" behindDoc="1" locked="0" layoutInCell="1" allowOverlap="1" wp14:anchorId="2D66BE1D" wp14:editId="0995B542">
+          <wp:anchor distT="0" distB="0" distL="114300" distR="114300" simplePos="0" relativeHeight="251658240" behindDoc="1" locked="0" layoutInCell="1" allowOverlap="1" wp14:anchorId="2D66BE1D" wp14:editId="2847B870">
             <wp:simplePos x="0" y="0"/>
             <wp:positionH relativeFrom="column">
               <wp:posOffset>-589915</wp:posOffset>
@@ -276,7 +276,21 @@
                               <w:rPr>
                                 <w:color w:val="FFFFFF" w:themeColor="background1"/>
                               </w:rPr>
-                              <w:t xml:space="preserve">, Ignacio de la Vega, Sebastian </w:t>
+                              <w:t xml:space="preserve">, Ignacio de la Vega, </w:t>
+                            </w:r>
+                            <w:proofErr w:type="spellStart"/>
+                            <w:r>
+                              <w:rPr>
+                                <w:color w:val="FFFFFF" w:themeColor="background1"/>
+                              </w:rPr>
+                              <w:t>Sebastian</w:t>
+                            </w:r>
+                            <w:proofErr w:type="spellEnd"/>
+                            <w:r>
+                              <w:rPr>
+                                <w:color w:val="FFFFFF" w:themeColor="background1"/>
+                              </w:rPr>
+                              <w:t xml:space="preserve"> </w:t>
                             </w:r>
                             <w:proofErr w:type="spellStart"/>
                             <w:r>
@@ -342,21 +356,7 @@
                               <w:rPr>
                                 <w:color w:val="FFFFFF" w:themeColor="background1"/>
                               </w:rPr>
-                              <w:t xml:space="preserve"> Escalante </w:t>
-                            </w:r>
-                            <w:proofErr w:type="spellStart"/>
-                            <w:r>
-                              <w:rPr>
-                                <w:color w:val="FFFFFF" w:themeColor="background1"/>
-                              </w:rPr>
-                              <w:t>Issele</w:t>
-                            </w:r>
-                            <w:proofErr w:type="spellEnd"/>
-                            <w:r>
-                              <w:rPr>
-                                <w:color w:val="FFFFFF" w:themeColor="background1"/>
-                              </w:rPr>
-                              <w:t>.</w:t>
+                              <w:t xml:space="preserve"> Escalante Issele.</w:t>
                             </w:r>
                           </w:p>
                           <w:p>
@@ -662,8 +662,6 @@
             </w:rPr>
             <w:t>Tabla de contenidos</w:t>
           </w:r>
-          <w:bookmarkStart w:id="3" w:name="_GoBack"/>
-          <w:bookmarkEnd w:id="3"/>
         </w:p>
         <w:p>
           <w:pPr>
@@ -2398,7 +2396,7 @@
           <w:szCs w:val="32"/>
         </w:rPr>
       </w:pPr>
-      <w:bookmarkStart w:id="4" w:name="_Toc227699651"/>
+      <w:bookmarkStart w:id="3" w:name="_Toc227699651"/>
       <w:r>
         <w:rPr>
           <w:b/>
@@ -2410,7 +2408,7 @@
         <w:t>Introducción</w:t>
       </w:r>
       <w:bookmarkEnd w:id="1"/>
-      <w:bookmarkEnd w:id="4"/>
+      <w:bookmarkEnd w:id="3"/>
     </w:p>
     <w:p>
       <w:r>
@@ -2471,7 +2469,7 @@
           <w:szCs w:val="32"/>
         </w:rPr>
       </w:pPr>
-      <w:bookmarkStart w:id="5" w:name="_Toc227699652"/>
+      <w:bookmarkStart w:id="4" w:name="_Toc227699652"/>
       <w:r>
         <w:rPr>
           <w:b/>
@@ -2483,7 +2481,7 @@
         <w:t>Desarrollo</w:t>
       </w:r>
       <w:bookmarkEnd w:id="2"/>
-      <w:bookmarkEnd w:id="5"/>
+      <w:bookmarkEnd w:id="4"/>
     </w:p>
     <w:p>
       <w:pPr>
@@ -2494,7 +2492,7 @@
           <w:szCs w:val="24"/>
         </w:rPr>
       </w:pPr>
-      <w:bookmarkStart w:id="6" w:name="_Toc227699653"/>
+      <w:bookmarkStart w:id="5" w:name="_Toc227699653"/>
       <w:r>
         <w:rPr>
           <w:b/>
@@ -2503,7 +2501,7 @@
         </w:rPr>
         <w:t>1. Estructura del Proyecto</w:t>
       </w:r>
-      <w:bookmarkEnd w:id="6"/>
+      <w:bookmarkEnd w:id="5"/>
     </w:p>
     <w:p>
       <w:r>
@@ -3204,7 +3202,7 @@
           <w:bCs/>
         </w:rPr>
       </w:pPr>
-      <w:bookmarkStart w:id="7" w:name="_Toc227699654"/>
+      <w:bookmarkStart w:id="6" w:name="_Toc227699654"/>
       <w:r>
         <w:rPr>
           <w:b/>
@@ -3212,7 +3210,7 @@
         </w:rPr>
         <w:t>2. Generación del Certificado SSL con OpenSSL</w:t>
       </w:r>
-      <w:bookmarkEnd w:id="7"/>
+      <w:bookmarkEnd w:id="6"/>
     </w:p>
     <w:p>
       <w:r>
@@ -3253,7 +3251,7 @@
           <w:bCs/>
         </w:rPr>
       </w:pPr>
-      <w:bookmarkStart w:id="8" w:name="_Toc227699655"/>
+      <w:bookmarkStart w:id="7" w:name="_Toc227699655"/>
       <w:r>
         <w:rPr>
           <w:b/>
@@ -3262,7 +3260,7 @@
         <w:lastRenderedPageBreak/>
         <w:t>2.1 Verificación de OpenSSL</w:t>
       </w:r>
-      <w:bookmarkEnd w:id="8"/>
+      <w:bookmarkEnd w:id="7"/>
     </w:p>
     <w:p>
       <w:r>
@@ -3346,7 +3344,7 @@
           <w:bCs/>
         </w:rPr>
       </w:pPr>
-      <w:bookmarkStart w:id="9" w:name="_Toc227699656"/>
+      <w:bookmarkStart w:id="8" w:name="_Toc227699656"/>
       <w:r>
         <w:rPr>
           <w:b/>
@@ -3354,7 +3352,7 @@
         </w:rPr>
         <w:t>2.2 Creación de la carpeta de certificados</w:t>
       </w:r>
-      <w:bookmarkEnd w:id="9"/>
+      <w:bookmarkEnd w:id="8"/>
     </w:p>
     <w:p>
       <w:r>
@@ -3460,7 +3458,7 @@
           <w:bCs/>
         </w:rPr>
       </w:pPr>
-      <w:bookmarkStart w:id="10" w:name="_Toc227699657"/>
+      <w:bookmarkStart w:id="9" w:name="_Toc227699657"/>
       <w:r>
         <w:rPr>
           <w:b/>
@@ -3476,7 +3474,7 @@
         </w:rPr>
         <w:t>.3 Comando de generación del certificado</w:t>
       </w:r>
-      <w:bookmarkEnd w:id="10"/>
+      <w:bookmarkEnd w:id="9"/>
     </w:p>
     <w:p>
       <w:r>
@@ -3652,7 +3650,7 @@
           <w:bCs/>
         </w:rPr>
       </w:pPr>
-      <w:bookmarkStart w:id="11" w:name="_Toc227699658"/>
+      <w:bookmarkStart w:id="10" w:name="_Toc227699658"/>
       <w:r>
         <w:rPr>
           <w:rFonts w:eastAsia="Arial"/>
@@ -3662,7 +3660,7 @@
         <w:lastRenderedPageBreak/>
         <w:t>3. Configuración del Servidor HTTPS en Express</w:t>
       </w:r>
-      <w:bookmarkEnd w:id="11"/>
+      <w:bookmarkEnd w:id="10"/>
     </w:p>
     <w:p>
       <w:r>
@@ -3684,7 +3682,7 @@
           <w:bCs/>
         </w:rPr>
       </w:pPr>
-      <w:bookmarkStart w:id="12" w:name="_Toc227699659"/>
+      <w:bookmarkStart w:id="11" w:name="_Toc227699659"/>
       <w:r>
         <w:rPr>
           <w:rFonts w:eastAsia="Arial"/>
@@ -3693,7 +3691,7 @@
         </w:rPr>
         <w:t>3.1 app.js – Inicialización de Express</w:t>
       </w:r>
-      <w:bookmarkEnd w:id="12"/>
+      <w:bookmarkEnd w:id="11"/>
     </w:p>
     <w:p>
       <w:r>
@@ -3771,7 +3769,7 @@
           <w:bCs/>
         </w:rPr>
       </w:pPr>
-      <w:bookmarkStart w:id="13" w:name="_Toc227699660"/>
+      <w:bookmarkStart w:id="12" w:name="_Toc227699660"/>
       <w:r>
         <w:rPr>
           <w:b/>
@@ -3786,7 +3784,7 @@
         </w:rPr>
         <w:t>.2 server.js – Creación del Servidor HTTPS</w:t>
       </w:r>
-      <w:bookmarkEnd w:id="13"/>
+      <w:bookmarkEnd w:id="12"/>
     </w:p>
     <w:p>
       <w:r>
@@ -3880,7 +3878,7 @@
           <w:bCs/>
         </w:rPr>
       </w:pPr>
-      <w:bookmarkStart w:id="14" w:name="_Toc227699661"/>
+      <w:bookmarkStart w:id="13" w:name="_Toc227699661"/>
       <w:r>
         <w:rPr>
           <w:b/>
@@ -3888,19 +3886,11 @@
         </w:rPr>
         <w:t>3.3 routes.js – Lógica de Rutas</w:t>
       </w:r>
-      <w:bookmarkEnd w:id="14"/>
+      <w:bookmarkEnd w:id="13"/>
     </w:p>
     <w:p>
       <w:r>
-        <w:t xml:space="preserve">Se implementó un </w:t>
-      </w:r>
-      <w:proofErr w:type="spellStart"/>
-      <w:r>
-        <w:t>router</w:t>
-      </w:r>
-      <w:proofErr w:type="spellEnd"/>
-      <w:r>
-        <w:t xml:space="preserve"> independiente usando </w:t>
+        <w:t xml:space="preserve">Se implementó un router independiente usando </w:t>
       </w:r>
       <w:proofErr w:type="spellStart"/>
       <w:r>
@@ -4005,7 +3995,7 @@
           <w:bCs/>
         </w:rPr>
       </w:pPr>
-      <w:bookmarkStart w:id="15" w:name="_Toc227699662"/>
+      <w:bookmarkStart w:id="14" w:name="_Toc227699662"/>
       <w:r>
         <w:rPr>
           <w:b/>
@@ -4014,7 +4004,7 @@
         <w:lastRenderedPageBreak/>
         <w:t>4. Comprensión de Protocolos, Seguridad y Cifrado</w:t>
       </w:r>
-      <w:bookmarkEnd w:id="15"/>
+      <w:bookmarkEnd w:id="14"/>
     </w:p>
     <w:p>
       <w:pPr>
@@ -4024,7 +4014,7 @@
           <w:bCs/>
         </w:rPr>
       </w:pPr>
-      <w:bookmarkStart w:id="16" w:name="_Toc227699663"/>
+      <w:bookmarkStart w:id="15" w:name="_Toc227699663"/>
       <w:r>
         <w:rPr>
           <w:b/>
@@ -4032,7 +4022,7 @@
         </w:rPr>
         <w:t>4.1 ¿Qué es HTTPS y cómo funciona?</w:t>
       </w:r>
-      <w:bookmarkEnd w:id="16"/>
+      <w:bookmarkEnd w:id="15"/>
     </w:p>
     <w:p>
       <w:r>
@@ -4068,15 +4058,7 @@
       </w:r>
       <w:proofErr w:type="spellEnd"/>
       <w:r>
-        <w:t xml:space="preserve"> </w:t>
-      </w:r>
-      <w:proofErr w:type="spellStart"/>
-      <w:r>
-        <w:t>Layer</w:t>
-      </w:r>
-      <w:proofErr w:type="spellEnd"/>
-      <w:r>
-        <w:t xml:space="preserve"> Security), sucesor de SSL.</w:t>
+        <w:t xml:space="preserve"> Layer Security), sucesor de SSL.</w:t>
       </w:r>
     </w:p>
     <w:p/>
@@ -4162,7 +4144,7 @@
           <w:bCs/>
         </w:rPr>
       </w:pPr>
-      <w:bookmarkStart w:id="17" w:name="_Toc227699664"/>
+      <w:bookmarkStart w:id="16" w:name="_Toc227699664"/>
       <w:r>
         <w:rPr>
           <w:b/>
@@ -4178,7 +4160,7 @@
         </w:rPr>
         <w:t>Backend</w:t>
       </w:r>
-      <w:bookmarkEnd w:id="17"/>
+      <w:bookmarkEnd w:id="16"/>
       <w:proofErr w:type="spellEnd"/>
     </w:p>
     <w:p>
@@ -4234,7 +4216,7 @@
           <w:bCs/>
         </w:rPr>
       </w:pPr>
-      <w:bookmarkStart w:id="18" w:name="_Toc227699665"/>
+      <w:bookmarkStart w:id="17" w:name="_Toc227699665"/>
       <w:r>
         <w:rPr>
           <w:b/>
@@ -4243,7 +4225,7 @@
         <w:lastRenderedPageBreak/>
         <w:t>4.3 Rol del Certificado SSL y la Criptografía Asimétrica</w:t>
       </w:r>
-      <w:bookmarkEnd w:id="18"/>
+      <w:bookmarkEnd w:id="17"/>
     </w:p>
     <w:p>
       <w:r>
@@ -4267,7 +4249,7 @@
           <w:bCs/>
         </w:rPr>
       </w:pPr>
-      <w:bookmarkStart w:id="19" w:name="_Toc227699666"/>
+      <w:bookmarkStart w:id="18" w:name="_Toc227699666"/>
       <w:r>
         <w:rPr>
           <w:b/>
@@ -4275,7 +4257,7 @@
         </w:rPr>
         <w:t>5. Pruebas Realizadas en el Navegador</w:t>
       </w:r>
-      <w:bookmarkEnd w:id="19"/>
+      <w:bookmarkEnd w:id="18"/>
       <w:r>
         <w:rPr>
           <w:b/>
@@ -4292,7 +4274,7 @@
           <w:bCs/>
         </w:rPr>
       </w:pPr>
-      <w:bookmarkStart w:id="20" w:name="_Toc227699667"/>
+      <w:bookmarkStart w:id="19" w:name="_Toc227699667"/>
       <w:r>
         <w:rPr>
           <w:b/>
@@ -4300,7 +4282,7 @@
         </w:rPr>
         <w:t>5.1 Inicio del servidor</w:t>
       </w:r>
-      <w:bookmarkEnd w:id="20"/>
+      <w:bookmarkEnd w:id="19"/>
     </w:p>
     <w:p>
       <w:r>
@@ -4382,7 +4364,7 @@
           <w:bCs/>
         </w:rPr>
       </w:pPr>
-      <w:bookmarkStart w:id="21" w:name="_Toc227699668"/>
+      <w:bookmarkStart w:id="20" w:name="_Toc227699668"/>
       <w:r>
         <w:rPr>
           <w:b/>
@@ -4398,7 +4380,7 @@
         </w:rPr>
         <w:t>auto-firmado</w:t>
       </w:r>
-      <w:bookmarkEnd w:id="21"/>
+      <w:bookmarkEnd w:id="20"/>
       <w:proofErr w:type="spellEnd"/>
     </w:p>
     <w:p>
@@ -4523,7 +4505,7 @@
           <w:bCs/>
         </w:rPr>
       </w:pPr>
-      <w:bookmarkStart w:id="22" w:name="_Toc227699669"/>
+      <w:bookmarkStart w:id="21" w:name="_Toc227699669"/>
       <w:r>
         <w:rPr>
           <w:b/>
@@ -4532,7 +4514,7 @@
         <w:lastRenderedPageBreak/>
         <w:t>5.3 Rutas probadas</w:t>
       </w:r>
-      <w:bookmarkEnd w:id="22"/>
+      <w:bookmarkEnd w:id="21"/>
     </w:p>
     <w:tbl>
       <w:tblPr>
@@ -4992,7 +4974,7 @@
           <w:bCs/>
         </w:rPr>
       </w:pPr>
-      <w:bookmarkStart w:id="23" w:name="_Toc227699670"/>
+      <w:bookmarkStart w:id="22" w:name="_Toc227699670"/>
       <w:r>
         <w:rPr>
           <w:b/>
@@ -5000,19 +4982,11 @@
         </w:rPr>
         <w:t>6. Roles del Equipo y Trabajo Colaborativo en GitHub</w:t>
       </w:r>
-      <w:bookmarkEnd w:id="23"/>
+      <w:bookmarkEnd w:id="22"/>
     </w:p>
     <w:p>
       <w:r>
-        <w:t xml:space="preserve">El trabajo fue organizado siguiendo la metodología sugerida por la actividad, con cada integrante actuando en una rama Git diferente y utilizando </w:t>
-      </w:r>
-      <w:proofErr w:type="spellStart"/>
-      <w:r>
-        <w:t>Pull</w:t>
-      </w:r>
-      <w:proofErr w:type="spellEnd"/>
-      <w:r>
-        <w:t xml:space="preserve"> </w:t>
+        <w:t xml:space="preserve">El trabajo fue organizado siguiendo la metodología sugerida por la actividad, con cada integrante actuando en una rama Git diferente y utilizando Pull </w:t>
       </w:r>
       <w:proofErr w:type="spellStart"/>
       <w:r>
@@ -5135,8 +5109,13 @@
             </w:tcMar>
           </w:tcPr>
           <w:p>
-            <w:r>
-              <w:t xml:space="preserve">Sebastian </w:t>
+            <w:proofErr w:type="spellStart"/>
+            <w:r>
+              <w:t>Sebastian</w:t>
+            </w:r>
+            <w:proofErr w:type="spellEnd"/>
+            <w:r>
+              <w:t xml:space="preserve"> </w:t>
             </w:r>
             <w:proofErr w:type="spellStart"/>
             <w:r>
@@ -5418,7 +5397,7 @@
           <w:bCs/>
         </w:rPr>
       </w:pPr>
-      <w:bookmarkStart w:id="24" w:name="_Toc227699671"/>
+      <w:bookmarkStart w:id="23" w:name="_Toc227699671"/>
       <w:r>
         <w:rPr>
           <w:rFonts w:eastAsia="Arial"/>
@@ -5453,7 +5432,7 @@
         </w:rPr>
         <w:t xml:space="preserve"> vs Entornos Productivos</w:t>
       </w:r>
-      <w:bookmarkEnd w:id="24"/>
+      <w:bookmarkEnd w:id="23"/>
     </w:p>
     <w:p>
       <w:r>
@@ -5590,6 +5569,464 @@
         <w:t xml:space="preserve"> no se limita al cifrado técnico, sino que exige confianza verificable, aspecto fundamental en sistemas que manejan datos sensibles de usuarios.</w:t>
       </w:r>
     </w:p>
+    <w:p/>
+    <w:p>
+      <w:pPr>
+        <w:pStyle w:val="Ttulo3"/>
+        <w:rPr>
+          <w:rFonts w:eastAsia="Arial"/>
+          <w:b/>
+          <w:bCs/>
+        </w:rPr>
+      </w:pPr>
+      <w:r>
+        <w:rPr>
+          <w:rFonts w:eastAsia="Arial"/>
+          <w:b/>
+          <w:bCs/>
+        </w:rPr>
+        <w:t>7</w:t>
+      </w:r>
+      <w:r>
+        <w:rPr>
+          <w:rFonts w:eastAsia="Arial"/>
+          <w:b/>
+          <w:bCs/>
+        </w:rPr>
+        <w:t xml:space="preserve">. </w:t>
+      </w:r>
+      <w:r>
+        <w:rPr>
+          <w:rFonts w:eastAsia="Arial"/>
+          <w:b/>
+          <w:bCs/>
+        </w:rPr>
+        <w:t>Link del repositorio del proyecto en GitHub</w:t>
+      </w:r>
+    </w:p>
+    <w:p/>
+    <w:p>
+      <w:pPr>
+        <w:rPr>
+          <w:i/>
+          <w:iCs/>
+        </w:rPr>
+      </w:pPr>
+      <w:hyperlink r:id="rId22" w:history="1">
+        <w:r>
+          <w:rPr>
+            <w:rStyle w:val="Hipervnculo"/>
+            <w:i/>
+            <w:iCs/>
+          </w:rPr>
+          <w:t>https://github.com/gruposiete-aiep/semana5-certifica</w:t>
+        </w:r>
+        <w:r>
+          <w:rPr>
+            <w:rStyle w:val="Hipervnculo"/>
+            <w:i/>
+            <w:iCs/>
+          </w:rPr>
+          <w:t>d</w:t>
+        </w:r>
+        <w:r>
+          <w:rPr>
+            <w:rStyle w:val="Hipervnculo"/>
+            <w:i/>
+            <w:iCs/>
+          </w:rPr>
+          <w:t>o-ssl-nodejs</w:t>
+        </w:r>
+      </w:hyperlink>
+    </w:p>
+    <w:p/>
+    <w:tbl>
+      <w:tblPr>
+        <w:tblW w:w="0" w:type="auto"/>
+        <w:jc w:val="center"/>
+        <w:tblCellMar>
+          <w:top w:w="15" w:type="dxa"/>
+          <w:left w:w="15" w:type="dxa"/>
+          <w:bottom w:w="15" w:type="dxa"/>
+          <w:right w:w="15" w:type="dxa"/>
+        </w:tblCellMar>
+        <w:tblLook w:val="04A0" w:firstRow="1" w:lastRow="0" w:firstColumn="1" w:lastColumn="0" w:noHBand="0" w:noVBand="1"/>
+      </w:tblPr>
+      <w:tblGrid>
+        <w:gridCol w:w="2630"/>
+        <w:gridCol w:w="1871"/>
+        <w:gridCol w:w="2929"/>
+      </w:tblGrid>
+      <w:tr>
+        <w:trPr>
+          <w:tblHeader/>
+          <w:jc w:val="center"/>
+        </w:trPr>
+        <w:tc>
+          <w:tcPr>
+            <w:tcW w:w="0" w:type="auto"/>
+            <w:tcBorders>
+              <w:top w:val="single" w:sz="6" w:space="0" w:color="3D444D"/>
+              <w:left w:val="single" w:sz="6" w:space="0" w:color="3D444D"/>
+              <w:bottom w:val="single" w:sz="6" w:space="0" w:color="3D444D"/>
+              <w:right w:val="single" w:sz="6" w:space="0" w:color="3D444D"/>
+            </w:tcBorders>
+            <w:tcMar>
+              <w:top w:w="90" w:type="dxa"/>
+              <w:left w:w="195" w:type="dxa"/>
+              <w:bottom w:w="90" w:type="dxa"/>
+              <w:right w:w="195" w:type="dxa"/>
+            </w:tcMar>
+            <w:vAlign w:val="center"/>
+            <w:hideMark/>
+          </w:tcPr>
+          <w:p>
+            <w:pPr>
+              <w:rPr>
+                <w:b/>
+                <w:bCs/>
+              </w:rPr>
+            </w:pPr>
+            <w:r>
+              <w:rPr>
+                <w:b/>
+                <w:bCs/>
+              </w:rPr>
+              <w:t>Integrante</w:t>
+            </w:r>
+          </w:p>
+        </w:tc>
+        <w:tc>
+          <w:tcPr>
+            <w:tcW w:w="0" w:type="auto"/>
+            <w:tcBorders>
+              <w:top w:val="single" w:sz="6" w:space="0" w:color="3D444D"/>
+              <w:left w:val="single" w:sz="6" w:space="0" w:color="3D444D"/>
+              <w:bottom w:val="single" w:sz="6" w:space="0" w:color="3D444D"/>
+              <w:right w:val="single" w:sz="6" w:space="0" w:color="3D444D"/>
+            </w:tcBorders>
+            <w:tcMar>
+              <w:top w:w="90" w:type="dxa"/>
+              <w:left w:w="195" w:type="dxa"/>
+              <w:bottom w:w="90" w:type="dxa"/>
+              <w:right w:w="195" w:type="dxa"/>
+            </w:tcMar>
+            <w:vAlign w:val="center"/>
+            <w:hideMark/>
+          </w:tcPr>
+          <w:p>
+            <w:pPr>
+              <w:rPr>
+                <w:b/>
+                <w:bCs/>
+              </w:rPr>
+            </w:pPr>
+            <w:r>
+              <w:rPr>
+                <w:b/>
+                <w:bCs/>
+              </w:rPr>
+              <w:t>GitHub</w:t>
+            </w:r>
+          </w:p>
+        </w:tc>
+        <w:tc>
+          <w:tcPr>
+            <w:tcW w:w="0" w:type="auto"/>
+            <w:tcBorders>
+              <w:top w:val="single" w:sz="6" w:space="0" w:color="3D444D"/>
+              <w:left w:val="single" w:sz="6" w:space="0" w:color="3D444D"/>
+              <w:bottom w:val="single" w:sz="6" w:space="0" w:color="3D444D"/>
+              <w:right w:val="single" w:sz="6" w:space="0" w:color="3D444D"/>
+            </w:tcBorders>
+            <w:tcMar>
+              <w:top w:w="90" w:type="dxa"/>
+              <w:left w:w="195" w:type="dxa"/>
+              <w:bottom w:w="90" w:type="dxa"/>
+              <w:right w:w="195" w:type="dxa"/>
+            </w:tcMar>
+            <w:vAlign w:val="center"/>
+            <w:hideMark/>
+          </w:tcPr>
+          <w:p>
+            <w:pPr>
+              <w:rPr>
+                <w:b/>
+                <w:bCs/>
+              </w:rPr>
+            </w:pPr>
+            <w:r>
+              <w:rPr>
+                <w:b/>
+                <w:bCs/>
+              </w:rPr>
+              <w:t>Rol</w:t>
+            </w:r>
+          </w:p>
+        </w:tc>
+      </w:tr>
+      <w:tr>
+        <w:trPr>
+          <w:jc w:val="center"/>
+        </w:trPr>
+        <w:tc>
+          <w:tcPr>
+            <w:tcW w:w="0" w:type="auto"/>
+            <w:tcBorders>
+              <w:top w:val="single" w:sz="6" w:space="0" w:color="3D444D"/>
+              <w:left w:val="single" w:sz="6" w:space="0" w:color="3D444D"/>
+              <w:bottom w:val="single" w:sz="6" w:space="0" w:color="3D444D"/>
+              <w:right w:val="single" w:sz="6" w:space="0" w:color="3D444D"/>
+            </w:tcBorders>
+            <w:tcMar>
+              <w:top w:w="90" w:type="dxa"/>
+              <w:left w:w="195" w:type="dxa"/>
+              <w:bottom w:w="90" w:type="dxa"/>
+              <w:right w:w="195" w:type="dxa"/>
+            </w:tcMar>
+            <w:vAlign w:val="center"/>
+            <w:hideMark/>
+          </w:tcPr>
+          <w:p>
+            <w:r>
+              <w:t xml:space="preserve">Sebastián </w:t>
+            </w:r>
+            <w:proofErr w:type="spellStart"/>
+            <w:r>
+              <w:t>Alvarez</w:t>
+            </w:r>
+            <w:proofErr w:type="spellEnd"/>
+          </w:p>
+        </w:tc>
+        <w:tc>
+          <w:tcPr>
+            <w:tcW w:w="0" w:type="auto"/>
+            <w:tcBorders>
+              <w:top w:val="single" w:sz="6" w:space="0" w:color="3D444D"/>
+              <w:left w:val="single" w:sz="6" w:space="0" w:color="3D444D"/>
+              <w:bottom w:val="single" w:sz="6" w:space="0" w:color="3D444D"/>
+              <w:right w:val="single" w:sz="6" w:space="0" w:color="3D444D"/>
+            </w:tcBorders>
+            <w:tcMar>
+              <w:top w:w="90" w:type="dxa"/>
+              <w:left w:w="195" w:type="dxa"/>
+              <w:bottom w:w="90" w:type="dxa"/>
+              <w:right w:w="195" w:type="dxa"/>
+            </w:tcMar>
+            <w:vAlign w:val="center"/>
+            <w:hideMark/>
+          </w:tcPr>
+          <w:p>
+            <w:hyperlink r:id="rId23" w:history="1">
+              <w:r>
+                <w:rPr>
+                  <w:rStyle w:val="Hipervnculo"/>
+                </w:rPr>
+                <w:t>@seba23ar</w:t>
+              </w:r>
+            </w:hyperlink>
+          </w:p>
+        </w:tc>
+        <w:tc>
+          <w:tcPr>
+            <w:tcW w:w="0" w:type="auto"/>
+            <w:tcBorders>
+              <w:top w:val="single" w:sz="6" w:space="0" w:color="3D444D"/>
+              <w:left w:val="single" w:sz="6" w:space="0" w:color="3D444D"/>
+              <w:bottom w:val="single" w:sz="6" w:space="0" w:color="3D444D"/>
+              <w:right w:val="single" w:sz="6" w:space="0" w:color="3D444D"/>
+            </w:tcBorders>
+            <w:tcMar>
+              <w:top w:w="90" w:type="dxa"/>
+              <w:left w:w="195" w:type="dxa"/>
+              <w:bottom w:w="90" w:type="dxa"/>
+              <w:right w:w="195" w:type="dxa"/>
+            </w:tcMar>
+            <w:vAlign w:val="center"/>
+            <w:hideMark/>
+          </w:tcPr>
+          <w:p>
+            <w:proofErr w:type="spellStart"/>
+            <w:r>
+              <w:t>Scaffold</w:t>
+            </w:r>
+            <w:proofErr w:type="spellEnd"/>
+            <w:r>
+              <w:t xml:space="preserve"> del proyecto</w:t>
+            </w:r>
+          </w:p>
+        </w:tc>
+      </w:tr>
+      <w:tr>
+        <w:trPr>
+          <w:jc w:val="center"/>
+        </w:trPr>
+        <w:tc>
+          <w:tcPr>
+            <w:tcW w:w="0" w:type="auto"/>
+            <w:tcBorders>
+              <w:top w:val="single" w:sz="6" w:space="0" w:color="3D444D"/>
+              <w:left w:val="single" w:sz="6" w:space="0" w:color="3D444D"/>
+              <w:bottom w:val="single" w:sz="6" w:space="0" w:color="3D444D"/>
+              <w:right w:val="single" w:sz="6" w:space="0" w:color="3D444D"/>
+            </w:tcBorders>
+            <w:tcMar>
+              <w:top w:w="90" w:type="dxa"/>
+              <w:left w:w="195" w:type="dxa"/>
+              <w:bottom w:w="90" w:type="dxa"/>
+              <w:right w:w="195" w:type="dxa"/>
+            </w:tcMar>
+            <w:vAlign w:val="center"/>
+            <w:hideMark/>
+          </w:tcPr>
+          <w:p>
+            <w:r>
+              <w:t xml:space="preserve">José </w:t>
+            </w:r>
+            <w:proofErr w:type="spellStart"/>
+            <w:r>
+              <w:t>Alvarez</w:t>
+            </w:r>
+            <w:proofErr w:type="spellEnd"/>
+          </w:p>
+        </w:tc>
+        <w:tc>
+          <w:tcPr>
+            <w:tcW w:w="0" w:type="auto"/>
+            <w:tcBorders>
+              <w:top w:val="single" w:sz="6" w:space="0" w:color="3D444D"/>
+              <w:left w:val="single" w:sz="6" w:space="0" w:color="3D444D"/>
+              <w:bottom w:val="single" w:sz="6" w:space="0" w:color="3D444D"/>
+              <w:right w:val="single" w:sz="6" w:space="0" w:color="3D444D"/>
+            </w:tcBorders>
+            <w:tcMar>
+              <w:top w:w="90" w:type="dxa"/>
+              <w:left w:w="195" w:type="dxa"/>
+              <w:bottom w:w="90" w:type="dxa"/>
+              <w:right w:w="195" w:type="dxa"/>
+            </w:tcMar>
+            <w:vAlign w:val="center"/>
+            <w:hideMark/>
+          </w:tcPr>
+          <w:p>
+            <w:hyperlink r:id="rId24" w:history="1">
+              <w:r>
+                <w:rPr>
+                  <w:rStyle w:val="Hipervnculo"/>
+                </w:rPr>
+                <w:t>@Arshael</w:t>
+              </w:r>
+            </w:hyperlink>
+          </w:p>
+        </w:tc>
+        <w:tc>
+          <w:tcPr>
+            <w:tcW w:w="0" w:type="auto"/>
+            <w:tcBorders>
+              <w:top w:val="single" w:sz="6" w:space="0" w:color="3D444D"/>
+              <w:left w:val="single" w:sz="6" w:space="0" w:color="3D444D"/>
+              <w:bottom w:val="single" w:sz="6" w:space="0" w:color="3D444D"/>
+              <w:right w:val="single" w:sz="6" w:space="0" w:color="3D444D"/>
+            </w:tcBorders>
+            <w:tcMar>
+              <w:top w:w="90" w:type="dxa"/>
+              <w:left w:w="195" w:type="dxa"/>
+              <w:bottom w:w="90" w:type="dxa"/>
+              <w:right w:w="195" w:type="dxa"/>
+            </w:tcMar>
+            <w:vAlign w:val="center"/>
+            <w:hideMark/>
+          </w:tcPr>
+          <w:p>
+            <w:r>
+              <w:t>Certificados SSL</w:t>
+            </w:r>
+          </w:p>
+        </w:tc>
+      </w:tr>
+      <w:tr>
+        <w:trPr>
+          <w:jc w:val="center"/>
+        </w:trPr>
+        <w:tc>
+          <w:tcPr>
+            <w:tcW w:w="0" w:type="auto"/>
+            <w:tcBorders>
+              <w:top w:val="single" w:sz="6" w:space="0" w:color="3D444D"/>
+              <w:left w:val="single" w:sz="6" w:space="0" w:color="3D444D"/>
+              <w:bottom w:val="single" w:sz="6" w:space="0" w:color="3D444D"/>
+              <w:right w:val="single" w:sz="6" w:space="0" w:color="3D444D"/>
+            </w:tcBorders>
+            <w:tcMar>
+              <w:top w:w="90" w:type="dxa"/>
+              <w:left w:w="195" w:type="dxa"/>
+              <w:bottom w:w="90" w:type="dxa"/>
+              <w:right w:w="195" w:type="dxa"/>
+            </w:tcMar>
+            <w:vAlign w:val="center"/>
+            <w:hideMark/>
+          </w:tcPr>
+          <w:p>
+            <w:r>
+              <w:t>Ignacio de la Vega</w:t>
+            </w:r>
+          </w:p>
+        </w:tc>
+        <w:tc>
+          <w:tcPr>
+            <w:tcW w:w="0" w:type="auto"/>
+            <w:tcBorders>
+              <w:top w:val="single" w:sz="6" w:space="0" w:color="3D444D"/>
+              <w:left w:val="single" w:sz="6" w:space="0" w:color="3D444D"/>
+              <w:bottom w:val="single" w:sz="6" w:space="0" w:color="3D444D"/>
+              <w:right w:val="single" w:sz="6" w:space="0" w:color="3D444D"/>
+            </w:tcBorders>
+            <w:tcMar>
+              <w:top w:w="90" w:type="dxa"/>
+              <w:left w:w="195" w:type="dxa"/>
+              <w:bottom w:w="90" w:type="dxa"/>
+              <w:right w:w="195" w:type="dxa"/>
+            </w:tcMar>
+            <w:vAlign w:val="center"/>
+            <w:hideMark/>
+          </w:tcPr>
+          <w:p>
+            <w:hyperlink r:id="rId25" w:history="1">
+              <w:r>
+                <w:rPr>
+                  <w:rStyle w:val="Hipervnculo"/>
+                </w:rPr>
+                <w:t>@NachooDV</w:t>
+              </w:r>
+            </w:hyperlink>
+          </w:p>
+        </w:tc>
+        <w:tc>
+          <w:tcPr>
+            <w:tcW w:w="0" w:type="auto"/>
+            <w:tcBorders>
+              <w:top w:val="single" w:sz="6" w:space="0" w:color="3D444D"/>
+              <w:left w:val="single" w:sz="6" w:space="0" w:color="3D444D"/>
+              <w:bottom w:val="single" w:sz="6" w:space="0" w:color="3D444D"/>
+              <w:right w:val="single" w:sz="6" w:space="0" w:color="3D444D"/>
+            </w:tcBorders>
+            <w:tcMar>
+              <w:top w:w="90" w:type="dxa"/>
+              <w:left w:w="195" w:type="dxa"/>
+              <w:bottom w:w="90" w:type="dxa"/>
+              <w:right w:w="195" w:type="dxa"/>
+            </w:tcMar>
+            <w:vAlign w:val="center"/>
+            <w:hideMark/>
+          </w:tcPr>
+          <w:p>
+            <w:r>
+              <w:t>Lógica de rutas</w:t>
+            </w:r>
+          </w:p>
+        </w:tc>
+      </w:tr>
+    </w:tbl>
     <w:p/>
     <w:p>
       <w:pPr>
@@ -5610,7 +6047,7 @@
           <w:szCs w:val="32"/>
         </w:rPr>
       </w:pPr>
-      <w:bookmarkStart w:id="25" w:name="_Toc227699672"/>
+      <w:bookmarkStart w:id="24" w:name="_Toc227699672"/>
       <w:r>
         <w:rPr>
           <w:b/>
@@ -5621,7 +6058,7 @@
         <w:lastRenderedPageBreak/>
         <w:t>Conclusión</w:t>
       </w:r>
-      <w:bookmarkEnd w:id="25"/>
+      <w:bookmarkEnd w:id="24"/>
     </w:p>
     <w:p>
       <w:r>
@@ -5774,8 +6211,8 @@
       <w:bookmarkEnd w:id="0"/>
     </w:p>
     <w:sectPr>
-      <w:headerReference w:type="default" r:id="rId22"/>
-      <w:footerReference w:type="default" r:id="rId23"/>
+      <w:headerReference w:type="default" r:id="rId26"/>
+      <w:footerReference w:type="default" r:id="rId27"/>
       <w:endnotePr>
         <w:numFmt w:val="decimal"/>
       </w:endnotePr>
@@ -5792,7 +6229,7 @@
 </file>
 
 <file path=word/endnotes.xml><?xml version="1.0" encoding="utf-8"?>
-<w:endnotes xmlns:wpc="http://schemas.microsoft.com/office/word/2010/wordprocessingCanvas" xmlns:cx="http://schemas.microsoft.com/office/drawing/2014/chartex" xmlns:cx1="http://schemas.microsoft.com/office/drawing/2015/9/8/chartex" xmlns:cx2="http://schemas.microsoft.com/office/drawing/2015/10/21/chartex" xmlns:cx3="http://schemas.microsoft.com/office/drawing/2016/5/9/chartex" xmlns:cx4="http://schemas.microsoft.com/office/drawing/2016/5/10/chartex" xmlns:cx5="http://schemas.microsoft.com/office/drawing/2016/5/11/chartex" xmlns:cx6="http://schemas.microsoft.com/office/drawing/2016/5/12/chartex" xmlns:cx7="http://schemas.microsoft.com/office/drawing/2016/5/13/chartex" xmlns:cx8="http://schemas.microsoft.com/office/drawing/2016/5/14/chartex" xmlns:mc="http://schemas.openxmlformats.org/markup-compatibility/2006" xmlns:aink="http://schemas.microsoft.com/office/drawing/2016/ink" xmlns:am3d="http://schemas.microsoft.com/office/drawing/2017/model3d" xmlns:o="urn:schemas-microsoft-com:office:office" xmlns:r="http://schemas.openxmlformats.org/officeDocument/2006/relationships" xmlns:m="http://schemas.openxmlformats.org/officeDocument/2006/math" xmlns:v="urn:schemas-microsoft-com:vml" xmlns:wp14="http://schemas.microsoft.com/office/word/2010/wordprocessingDrawing" xmlns:wp="http://schemas.openxmlformats.org/drawingml/2006/wordprocessingDrawing" xmlns:w10="urn:schemas-microsoft-com:office:word" xmlns:w="http://schemas.openxmlformats.org/wordprocessingml/2006/main" xmlns:w14="http://schemas.microsoft.com/office/word/2010/wordml" xmlns:w15="http://schemas.microsoft.com/office/word/2012/wordml" xmlns:w16cid="http://schemas.microsoft.com/office/word/2016/wordml/cid" xmlns:w16se="http://schemas.microsoft.com/office/word/2015/wordml/symex" xmlns:wpg="http://schemas.microsoft.com/office/word/2010/wordprocessingGroup" xmlns:wpi="http://schemas.microsoft.com/office/word/2010/wordprocessingInk" xmlns:wne="http://schemas.microsoft.com/office/word/2006/wordml" xmlns:wps="http://schemas.microsoft.com/office/word/2010/wordprocessingShape" mc:Ignorable="w14 w15 w16se w16cid wp14">
+<w:endnotes xmlns:wpc="http://schemas.microsoft.com/office/word/2010/wordprocessingCanvas" xmlns:cx="http://schemas.microsoft.com/office/drawing/2014/chartex" xmlns:cx1="http://schemas.microsoft.com/office/drawing/2015/9/8/chartex" xmlns:cx2="http://schemas.microsoft.com/office/drawing/2015/10/21/chartex" xmlns:cx3="http://schemas.microsoft.com/office/drawing/2016/5/9/chartex" xmlns:cx4="http://schemas.microsoft.com/office/drawing/2016/5/10/chartex" xmlns:cx5="http://schemas.microsoft.com/office/drawing/2016/5/11/chartex" xmlns:cx6="http://schemas.microsoft.com/office/drawing/2016/5/12/chartex" xmlns:cx7="http://schemas.microsoft.com/office/drawing/2016/5/13/chartex" xmlns:cx8="http://schemas.microsoft.com/office/drawing/2016/5/14/chartex" xmlns:mc="http://schemas.openxmlformats.org/markup-compatibility/2006" xmlns:aink="http://schemas.microsoft.com/office/drawing/2016/ink" xmlns:am3d="http://schemas.microsoft.com/office/drawing/2017/model3d" xmlns:o="urn:schemas-microsoft-com:office:office" xmlns:oel="http://schemas.microsoft.com/office/2019/extlst" xmlns:r="http://schemas.openxmlformats.org/officeDocument/2006/relationships" xmlns:m="http://schemas.openxmlformats.org/officeDocument/2006/math" xmlns:v="urn:schemas-microsoft-com:vml" xmlns:wp14="http://schemas.microsoft.com/office/word/2010/wordprocessingDrawing" xmlns:wp="http://schemas.openxmlformats.org/drawingml/2006/wordprocessingDrawing" xmlns:w10="urn:schemas-microsoft-com:office:word" xmlns:w="http://schemas.openxmlformats.org/wordprocessingml/2006/main" xmlns:w14="http://schemas.microsoft.com/office/word/2010/wordml" xmlns:w15="http://schemas.microsoft.com/office/word/2012/wordml" xmlns:w16cex="http://schemas.microsoft.com/office/word/2018/wordml/cex" xmlns:w16cid="http://schemas.microsoft.com/office/word/2016/wordml/cid" xmlns:w16="http://schemas.microsoft.com/office/word/2018/wordml" xmlns:w16du="http://schemas.microsoft.com/office/word/2023/wordml/word16du" xmlns:w16sdtdh="http://schemas.microsoft.com/office/word/2020/wordml/sdtdatahash" xmlns:w16sdtfl="http://schemas.microsoft.com/office/word/2024/wordml/sdtformatlock" xmlns:w16se="http://schemas.microsoft.com/office/word/2015/wordml/symex" xmlns:wpg="http://schemas.microsoft.com/office/word/2010/wordprocessingGroup" xmlns:wpi="http://schemas.microsoft.com/office/word/2010/wordprocessingInk" xmlns:wne="http://schemas.microsoft.com/office/word/2006/wordml" xmlns:wps="http://schemas.microsoft.com/office/word/2010/wordprocessingShape" mc:Ignorable="w14 w15 w16se w16cid w16 w16cex w16sdtdh w16sdtfl w16du wp14">
   <w:endnote w:type="separator" w:id="-1">
     <w:p>
       <w:r>
@@ -5814,7 +6251,7 @@
 </file>
 
 <file path=word/footer1.xml><?xml version="1.0" encoding="utf-8"?>
-<w:ftr xmlns:wpc="http://schemas.microsoft.com/office/word/2010/wordprocessingCanvas" xmlns:cx="http://schemas.microsoft.com/office/drawing/2014/chartex" xmlns:cx1="http://schemas.microsoft.com/office/drawing/2015/9/8/chartex" xmlns:cx2="http://schemas.microsoft.com/office/drawing/2015/10/21/chartex" xmlns:cx3="http://schemas.microsoft.com/office/drawing/2016/5/9/chartex" xmlns:cx4="http://schemas.microsoft.com/office/drawing/2016/5/10/chartex" xmlns:cx5="http://schemas.microsoft.com/office/drawing/2016/5/11/chartex" xmlns:cx6="http://schemas.microsoft.com/office/drawing/2016/5/12/chartex" xmlns:cx7="http://schemas.microsoft.com/office/drawing/2016/5/13/chartex" xmlns:cx8="http://schemas.microsoft.com/office/drawing/2016/5/14/chartex" xmlns:mc="http://schemas.openxmlformats.org/markup-compatibility/2006" xmlns:aink="http://schemas.microsoft.com/office/drawing/2016/ink" xmlns:am3d="http://schemas.microsoft.com/office/drawing/2017/model3d" xmlns:o="urn:schemas-microsoft-com:office:office" xmlns:r="http://schemas.openxmlformats.org/officeDocument/2006/relationships" xmlns:m="http://schemas.openxmlformats.org/officeDocument/2006/math" xmlns:v="urn:schemas-microsoft-com:vml" xmlns:wp14="http://schemas.microsoft.com/office/word/2010/wordprocessingDrawing" xmlns:wp="http://schemas.openxmlformats.org/drawingml/2006/wordprocessingDrawing" xmlns:w10="urn:schemas-microsoft-com:office:word" xmlns:w="http://schemas.openxmlformats.org/wordprocessingml/2006/main" xmlns:w14="http://schemas.microsoft.com/office/word/2010/wordml" xmlns:w15="http://schemas.microsoft.com/office/word/2012/wordml" xmlns:w16cid="http://schemas.microsoft.com/office/word/2016/wordml/cid" xmlns:w16se="http://schemas.microsoft.com/office/word/2015/wordml/symex" xmlns:wpg="http://schemas.microsoft.com/office/word/2010/wordprocessingGroup" xmlns:wpi="http://schemas.microsoft.com/office/word/2010/wordprocessingInk" xmlns:wne="http://schemas.microsoft.com/office/word/2006/wordml" xmlns:wps="http://schemas.microsoft.com/office/word/2010/wordprocessingShape" mc:Ignorable="w14 w15 w16se w16cid wp14">
+<w:ftr xmlns:wpc="http://schemas.microsoft.com/office/word/2010/wordprocessingCanvas" xmlns:cx="http://schemas.microsoft.com/office/drawing/2014/chartex" xmlns:cx1="http://schemas.microsoft.com/office/drawing/2015/9/8/chartex" xmlns:cx2="http://schemas.microsoft.com/office/drawing/2015/10/21/chartex" xmlns:cx3="http://schemas.microsoft.com/office/drawing/2016/5/9/chartex" xmlns:cx4="http://schemas.microsoft.com/office/drawing/2016/5/10/chartex" xmlns:cx5="http://schemas.microsoft.com/office/drawing/2016/5/11/chartex" xmlns:cx6="http://schemas.microsoft.com/office/drawing/2016/5/12/chartex" xmlns:cx7="http://schemas.microsoft.com/office/drawing/2016/5/13/chartex" xmlns:cx8="http://schemas.microsoft.com/office/drawing/2016/5/14/chartex" xmlns:mc="http://schemas.openxmlformats.org/markup-compatibility/2006" xmlns:aink="http://schemas.microsoft.com/office/drawing/2016/ink" xmlns:am3d="http://schemas.microsoft.com/office/drawing/2017/model3d" xmlns:o="urn:schemas-microsoft-com:office:office" xmlns:oel="http://schemas.microsoft.com/office/2019/extlst" xmlns:r="http://schemas.openxmlformats.org/officeDocument/2006/relationships" xmlns:m="http://schemas.openxmlformats.org/officeDocument/2006/math" xmlns:v="urn:schemas-microsoft-com:vml" xmlns:wp14="http://schemas.microsoft.com/office/word/2010/wordprocessingDrawing" xmlns:wp="http://schemas.openxmlformats.org/drawingml/2006/wordprocessingDrawing" xmlns:w10="urn:schemas-microsoft-com:office:word" xmlns:w="http://schemas.openxmlformats.org/wordprocessingml/2006/main" xmlns:w14="http://schemas.microsoft.com/office/word/2010/wordml" xmlns:w15="http://schemas.microsoft.com/office/word/2012/wordml" xmlns:w16cex="http://schemas.microsoft.com/office/word/2018/wordml/cex" xmlns:w16cid="http://schemas.microsoft.com/office/word/2016/wordml/cid" xmlns:w16="http://schemas.microsoft.com/office/word/2018/wordml" xmlns:w16du="http://schemas.microsoft.com/office/word/2023/wordml/word16du" xmlns:w16sdtdh="http://schemas.microsoft.com/office/word/2020/wordml/sdtdatahash" xmlns:w16sdtfl="http://schemas.microsoft.com/office/word/2024/wordml/sdtformatlock" xmlns:w16se="http://schemas.microsoft.com/office/word/2015/wordml/symex" xmlns:wpg="http://schemas.microsoft.com/office/word/2010/wordprocessingGroup" xmlns:wpi="http://schemas.microsoft.com/office/word/2010/wordprocessingInk" xmlns:wne="http://schemas.microsoft.com/office/word/2006/wordml" xmlns:wps="http://schemas.microsoft.com/office/word/2010/wordprocessingShape" mc:Ignorable="w14 w15 w16se w16cid w16 w16cex w16sdtdh w16sdtfl w16du wp14">
   <w:sdt>
     <w:sdtPr>
       <w:id w:val="-299607384"/>
@@ -5823,7 +6260,6 @@
         <w:docPartUnique/>
       </w:docPartObj>
     </w:sdtPr>
-    <w:sdtEndPr/>
     <w:sdtContent>
       <w:p>
         <w:pPr>
@@ -5901,7 +6337,7 @@
                 </wp:anchor>
               </w:drawing>
             </mc:Choice>
-            <mc:Fallback xmlns:w16sdtfl="http://schemas.microsoft.com/office/word/2024/wordml/sdtformatlock" xmlns:w16sdtdh="http://schemas.microsoft.com/office/word/2020/wordml/sdtdatahash" xmlns:w16du="http://schemas.microsoft.com/office/word/2023/wordml/word16du" xmlns:w16="http://schemas.microsoft.com/office/word/2018/wordml" xmlns:w16cex="http://schemas.microsoft.com/office/word/2018/wordml/cex" xmlns:oel="http://schemas.microsoft.com/office/2019/extlst">
+            <mc:Fallback>
               <w:pict>
                 <v:shapetype w14:anchorId="3FE79948" id="_x0000_t15" coordsize="21600,21600" o:spt="15" adj="16200" path="m@0,l,,,21600@0,21600,21600,10800xe">
                   <v:stroke joinstyle="miter"/>
@@ -5951,7 +6387,7 @@
 </file>
 
 <file path=word/footnotes.xml><?xml version="1.0" encoding="utf-8"?>
-<w:footnotes xmlns:wpc="http://schemas.microsoft.com/office/word/2010/wordprocessingCanvas" xmlns:cx="http://schemas.microsoft.com/office/drawing/2014/chartex" xmlns:cx1="http://schemas.microsoft.com/office/drawing/2015/9/8/chartex" xmlns:cx2="http://schemas.microsoft.com/office/drawing/2015/10/21/chartex" xmlns:cx3="http://schemas.microsoft.com/office/drawing/2016/5/9/chartex" xmlns:cx4="http://schemas.microsoft.com/office/drawing/2016/5/10/chartex" xmlns:cx5="http://schemas.microsoft.com/office/drawing/2016/5/11/chartex" xmlns:cx6="http://schemas.microsoft.com/office/drawing/2016/5/12/chartex" xmlns:cx7="http://schemas.microsoft.com/office/drawing/2016/5/13/chartex" xmlns:cx8="http://schemas.microsoft.com/office/drawing/2016/5/14/chartex" xmlns:mc="http://schemas.openxmlformats.org/markup-compatibility/2006" xmlns:aink="http://schemas.microsoft.com/office/drawing/2016/ink" xmlns:am3d="http://schemas.microsoft.com/office/drawing/2017/model3d" xmlns:o="urn:schemas-microsoft-com:office:office" xmlns:r="http://schemas.openxmlformats.org/officeDocument/2006/relationships" xmlns:m="http://schemas.openxmlformats.org/officeDocument/2006/math" xmlns:v="urn:schemas-microsoft-com:vml" xmlns:wp14="http://schemas.microsoft.com/office/word/2010/wordprocessingDrawing" xmlns:wp="http://schemas.openxmlformats.org/drawingml/2006/wordprocessingDrawing" xmlns:w10="urn:schemas-microsoft-com:office:word" xmlns:w="http://schemas.openxmlformats.org/wordprocessingml/2006/main" xmlns:w14="http://schemas.microsoft.com/office/word/2010/wordml" xmlns:w15="http://schemas.microsoft.com/office/word/2012/wordml" xmlns:w16cid="http://schemas.microsoft.com/office/word/2016/wordml/cid" xmlns:w16se="http://schemas.microsoft.com/office/word/2015/wordml/symex" xmlns:wpg="http://schemas.microsoft.com/office/word/2010/wordprocessingGroup" xmlns:wpi="http://schemas.microsoft.com/office/word/2010/wordprocessingInk" xmlns:wne="http://schemas.microsoft.com/office/word/2006/wordml" xmlns:wps="http://schemas.microsoft.com/office/word/2010/wordprocessingShape" mc:Ignorable="w14 w15 w16se w16cid wp14">
+<w:footnotes xmlns:wpc="http://schemas.microsoft.com/office/word/2010/wordprocessingCanvas" xmlns:cx="http://schemas.microsoft.com/office/drawing/2014/chartex" xmlns:cx1="http://schemas.microsoft.com/office/drawing/2015/9/8/chartex" xmlns:cx2="http://schemas.microsoft.com/office/drawing/2015/10/21/chartex" xmlns:cx3="http://schemas.microsoft.com/office/drawing/2016/5/9/chartex" xmlns:cx4="http://schemas.microsoft.com/office/drawing/2016/5/10/chartex" xmlns:cx5="http://schemas.microsoft.com/office/drawing/2016/5/11/chartex" xmlns:cx6="http://schemas.microsoft.com/office/drawing/2016/5/12/chartex" xmlns:cx7="http://schemas.microsoft.com/office/drawing/2016/5/13/chartex" xmlns:cx8="http://schemas.microsoft.com/office/drawing/2016/5/14/chartex" xmlns:mc="http://schemas.openxmlformats.org/markup-compatibility/2006" xmlns:aink="http://schemas.microsoft.com/office/drawing/2016/ink" xmlns:am3d="http://schemas.microsoft.com/office/drawing/2017/model3d" xmlns:o="urn:schemas-microsoft-com:office:office" xmlns:oel="http://schemas.microsoft.com/office/2019/extlst" xmlns:r="http://schemas.openxmlformats.org/officeDocument/2006/relationships" xmlns:m="http://schemas.openxmlformats.org/officeDocument/2006/math" xmlns:v="urn:schemas-microsoft-com:vml" xmlns:wp14="http://schemas.microsoft.com/office/word/2010/wordprocessingDrawing" xmlns:wp="http://schemas.openxmlformats.org/drawingml/2006/wordprocessingDrawing" xmlns:w10="urn:schemas-microsoft-com:office:word" xmlns:w="http://schemas.openxmlformats.org/wordprocessingml/2006/main" xmlns:w14="http://schemas.microsoft.com/office/word/2010/wordml" xmlns:w15="http://schemas.microsoft.com/office/word/2012/wordml" xmlns:w16cex="http://schemas.microsoft.com/office/word/2018/wordml/cex" xmlns:w16cid="http://schemas.microsoft.com/office/word/2016/wordml/cid" xmlns:w16="http://schemas.microsoft.com/office/word/2018/wordml" xmlns:w16du="http://schemas.microsoft.com/office/word/2023/wordml/word16du" xmlns:w16sdtdh="http://schemas.microsoft.com/office/word/2020/wordml/sdtdatahash" xmlns:w16sdtfl="http://schemas.microsoft.com/office/word/2024/wordml/sdtformatlock" xmlns:w16se="http://schemas.microsoft.com/office/word/2015/wordml/symex" xmlns:wpg="http://schemas.microsoft.com/office/word/2010/wordprocessingGroup" xmlns:wpi="http://schemas.microsoft.com/office/word/2010/wordprocessingInk" xmlns:wne="http://schemas.microsoft.com/office/word/2006/wordml" xmlns:wps="http://schemas.microsoft.com/office/word/2010/wordprocessingShape" mc:Ignorable="w14 w15 w16se w16cid w16 w16cex w16sdtdh w16sdtfl w16du wp14">
   <w:footnote w:type="separator" w:id="-1">
     <w:p>
       <w:r>
@@ -5973,7 +6409,7 @@
 </file>
 
 <file path=word/header1.xml><?xml version="1.0" encoding="utf-8"?>
-<w:hdr xmlns:wpc="http://schemas.microsoft.com/office/word/2010/wordprocessingCanvas" xmlns:cx="http://schemas.microsoft.com/office/drawing/2014/chartex" xmlns:cx1="http://schemas.microsoft.com/office/drawing/2015/9/8/chartex" xmlns:cx2="http://schemas.microsoft.com/office/drawing/2015/10/21/chartex" xmlns:cx3="http://schemas.microsoft.com/office/drawing/2016/5/9/chartex" xmlns:cx4="http://schemas.microsoft.com/office/drawing/2016/5/10/chartex" xmlns:cx5="http://schemas.microsoft.com/office/drawing/2016/5/11/chartex" xmlns:cx6="http://schemas.microsoft.com/office/drawing/2016/5/12/chartex" xmlns:cx7="http://schemas.microsoft.com/office/drawing/2016/5/13/chartex" xmlns:cx8="http://schemas.microsoft.com/office/drawing/2016/5/14/chartex" xmlns:mc="http://schemas.openxmlformats.org/markup-compatibility/2006" xmlns:aink="http://schemas.microsoft.com/office/drawing/2016/ink" xmlns:am3d="http://schemas.microsoft.com/office/drawing/2017/model3d" xmlns:o="urn:schemas-microsoft-com:office:office" xmlns:r="http://schemas.openxmlformats.org/officeDocument/2006/relationships" xmlns:m="http://schemas.openxmlformats.org/officeDocument/2006/math" xmlns:v="urn:schemas-microsoft-com:vml" xmlns:wp14="http://schemas.microsoft.com/office/word/2010/wordprocessingDrawing" xmlns:wp="http://schemas.openxmlformats.org/drawingml/2006/wordprocessingDrawing" xmlns:w10="urn:schemas-microsoft-com:office:word" xmlns:w="http://schemas.openxmlformats.org/wordprocessingml/2006/main" xmlns:w14="http://schemas.microsoft.com/office/word/2010/wordml" xmlns:w15="http://schemas.microsoft.com/office/word/2012/wordml" xmlns:w16cid="http://schemas.microsoft.com/office/word/2016/wordml/cid" xmlns:w16se="http://schemas.microsoft.com/office/word/2015/wordml/symex" xmlns:wpg="http://schemas.microsoft.com/office/word/2010/wordprocessingGroup" xmlns:wpi="http://schemas.microsoft.com/office/word/2010/wordprocessingInk" xmlns:wne="http://schemas.microsoft.com/office/word/2006/wordml" xmlns:wps="http://schemas.microsoft.com/office/word/2010/wordprocessingShape" mc:Ignorable="w14 w15 w16se w16cid wp14">
+<w:hdr xmlns:wpc="http://schemas.microsoft.com/office/word/2010/wordprocessingCanvas" xmlns:cx="http://schemas.microsoft.com/office/drawing/2014/chartex" xmlns:cx1="http://schemas.microsoft.com/office/drawing/2015/9/8/chartex" xmlns:cx2="http://schemas.microsoft.com/office/drawing/2015/10/21/chartex" xmlns:cx3="http://schemas.microsoft.com/office/drawing/2016/5/9/chartex" xmlns:cx4="http://schemas.microsoft.com/office/drawing/2016/5/10/chartex" xmlns:cx5="http://schemas.microsoft.com/office/drawing/2016/5/11/chartex" xmlns:cx6="http://schemas.microsoft.com/office/drawing/2016/5/12/chartex" xmlns:cx7="http://schemas.microsoft.com/office/drawing/2016/5/13/chartex" xmlns:cx8="http://schemas.microsoft.com/office/drawing/2016/5/14/chartex" xmlns:mc="http://schemas.openxmlformats.org/markup-compatibility/2006" xmlns:aink="http://schemas.microsoft.com/office/drawing/2016/ink" xmlns:am3d="http://schemas.microsoft.com/office/drawing/2017/model3d" xmlns:o="urn:schemas-microsoft-com:office:office" xmlns:oel="http://schemas.microsoft.com/office/2019/extlst" xmlns:r="http://schemas.openxmlformats.org/officeDocument/2006/relationships" xmlns:m="http://schemas.openxmlformats.org/officeDocument/2006/math" xmlns:v="urn:schemas-microsoft-com:vml" xmlns:wp14="http://schemas.microsoft.com/office/word/2010/wordprocessingDrawing" xmlns:wp="http://schemas.openxmlformats.org/drawingml/2006/wordprocessingDrawing" xmlns:w10="urn:schemas-microsoft-com:office:word" xmlns:w="http://schemas.openxmlformats.org/wordprocessingml/2006/main" xmlns:w14="http://schemas.microsoft.com/office/word/2010/wordml" xmlns:w15="http://schemas.microsoft.com/office/word/2012/wordml" xmlns:w16cex="http://schemas.microsoft.com/office/word/2018/wordml/cex" xmlns:w16cid="http://schemas.microsoft.com/office/word/2016/wordml/cid" xmlns:w16="http://schemas.microsoft.com/office/word/2018/wordml" xmlns:w16du="http://schemas.microsoft.com/office/word/2023/wordml/word16du" xmlns:w16sdtdh="http://schemas.microsoft.com/office/word/2020/wordml/sdtdatahash" xmlns:w16sdtfl="http://schemas.microsoft.com/office/word/2024/wordml/sdtformatlock" xmlns:w16se="http://schemas.microsoft.com/office/word/2015/wordml/symex" xmlns:wpg="http://schemas.microsoft.com/office/word/2010/wordprocessingGroup" xmlns:wpi="http://schemas.microsoft.com/office/word/2010/wordprocessingInk" xmlns:wne="http://schemas.microsoft.com/office/word/2006/wordml" xmlns:wps="http://schemas.microsoft.com/office/word/2010/wordprocessingShape" mc:Ignorable="w14 w15 w16se w16cid w16 w16cex w16sdtdh w16sdtfl w16du wp14">
   <w:p>
     <w:pPr>
       <w:pStyle w:val="Encabezado"/>
@@ -6060,7 +6496,7 @@
 </file>
 
 <file path=word/numbering.xml><?xml version="1.0" encoding="utf-8"?>
-<w:numbering xmlns:wpc="http://schemas.microsoft.com/office/word/2010/wordprocessingCanvas" xmlns:cx="http://schemas.microsoft.com/office/drawing/2014/chartex" xmlns:cx1="http://schemas.microsoft.com/office/drawing/2015/9/8/chartex" xmlns:cx2="http://schemas.microsoft.com/office/drawing/2015/10/21/chartex" xmlns:cx3="http://schemas.microsoft.com/office/drawing/2016/5/9/chartex" xmlns:cx4="http://schemas.microsoft.com/office/drawing/2016/5/10/chartex" xmlns:cx5="http://schemas.microsoft.com/office/drawing/2016/5/11/chartex" xmlns:cx6="http://schemas.microsoft.com/office/drawing/2016/5/12/chartex" xmlns:cx7="http://schemas.microsoft.com/office/drawing/2016/5/13/chartex" xmlns:cx8="http://schemas.microsoft.com/office/drawing/2016/5/14/chartex" xmlns:mc="http://schemas.openxmlformats.org/markup-compatibility/2006" xmlns:aink="http://schemas.microsoft.com/office/drawing/2016/ink" xmlns:am3d="http://schemas.microsoft.com/office/drawing/2017/model3d" xmlns:o="urn:schemas-microsoft-com:office:office" xmlns:r="http://schemas.openxmlformats.org/officeDocument/2006/relationships" xmlns:m="http://schemas.openxmlformats.org/officeDocument/2006/math" xmlns:v="urn:schemas-microsoft-com:vml" xmlns:wp14="http://schemas.microsoft.com/office/word/2010/wordprocessingDrawing" xmlns:wp="http://schemas.openxmlformats.org/drawingml/2006/wordprocessingDrawing" xmlns:w10="urn:schemas-microsoft-com:office:word" xmlns:w="http://schemas.openxmlformats.org/wordprocessingml/2006/main" xmlns:w14="http://schemas.microsoft.com/office/word/2010/wordml" xmlns:w15="http://schemas.microsoft.com/office/word/2012/wordml" xmlns:w16cid="http://schemas.microsoft.com/office/word/2016/wordml/cid" xmlns:w16se="http://schemas.microsoft.com/office/word/2015/wordml/symex" xmlns:wpg="http://schemas.microsoft.com/office/word/2010/wordprocessingGroup" xmlns:wpi="http://schemas.microsoft.com/office/word/2010/wordprocessingInk" xmlns:wne="http://schemas.microsoft.com/office/word/2006/wordml" xmlns:wps="http://schemas.microsoft.com/office/word/2010/wordprocessingShape" mc:Ignorable="w14 w15 w16se w16cid wp14">
+<w:numbering xmlns:wpc="http://schemas.microsoft.com/office/word/2010/wordprocessingCanvas" xmlns:cx="http://schemas.microsoft.com/office/drawing/2014/chartex" xmlns:cx1="http://schemas.microsoft.com/office/drawing/2015/9/8/chartex" xmlns:cx2="http://schemas.microsoft.com/office/drawing/2015/10/21/chartex" xmlns:cx3="http://schemas.microsoft.com/office/drawing/2016/5/9/chartex" xmlns:cx4="http://schemas.microsoft.com/office/drawing/2016/5/10/chartex" xmlns:cx5="http://schemas.microsoft.com/office/drawing/2016/5/11/chartex" xmlns:cx6="http://schemas.microsoft.com/office/drawing/2016/5/12/chartex" xmlns:cx7="http://schemas.microsoft.com/office/drawing/2016/5/13/chartex" xmlns:cx8="http://schemas.microsoft.com/office/drawing/2016/5/14/chartex" xmlns:mc="http://schemas.openxmlformats.org/markup-compatibility/2006" xmlns:aink="http://schemas.microsoft.com/office/drawing/2016/ink" xmlns:am3d="http://schemas.microsoft.com/office/drawing/2017/model3d" xmlns:o="urn:schemas-microsoft-com:office:office" xmlns:oel="http://schemas.microsoft.com/office/2019/extlst" xmlns:r="http://schemas.openxmlformats.org/officeDocument/2006/relationships" xmlns:m="http://schemas.openxmlformats.org/officeDocument/2006/math" xmlns:v="urn:schemas-microsoft-com:vml" xmlns:wp14="http://schemas.microsoft.com/office/word/2010/wordprocessingDrawing" xmlns:wp="http://schemas.openxmlformats.org/drawingml/2006/wordprocessingDrawing" xmlns:w10="urn:schemas-microsoft-com:office:word" xmlns:w="http://schemas.openxmlformats.org/wordprocessingml/2006/main" xmlns:w14="http://schemas.microsoft.com/office/word/2010/wordml" xmlns:w15="http://schemas.microsoft.com/office/word/2012/wordml" xmlns:w16cex="http://schemas.microsoft.com/office/word/2018/wordml/cex" xmlns:w16cid="http://schemas.microsoft.com/office/word/2016/wordml/cid" xmlns:w16="http://schemas.microsoft.com/office/word/2018/wordml" xmlns:w16du="http://schemas.microsoft.com/office/word/2023/wordml/word16du" xmlns:w16sdtdh="http://schemas.microsoft.com/office/word/2020/wordml/sdtdatahash" xmlns:w16sdtfl="http://schemas.microsoft.com/office/word/2024/wordml/sdtformatlock" xmlns:w16se="http://schemas.microsoft.com/office/word/2015/wordml/symex" xmlns:wpg="http://schemas.microsoft.com/office/word/2010/wordprocessingGroup" xmlns:wpi="http://schemas.microsoft.com/office/word/2010/wordprocessingInk" xmlns:wne="http://schemas.microsoft.com/office/word/2006/wordml" xmlns:wps="http://schemas.microsoft.com/office/word/2010/wordprocessingShape" mc:Ignorable="w14 w15 w16se w16cid w16 w16cex w16sdtdh w16sdtfl w16du wp14">
   <w:abstractNum w:abstractNumId="0" w15:restartNumberingAfterBreak="0">
     <w:nsid w:val="3E906029"/>
     <w:multiLevelType w:val="hybridMultilevel"/>
@@ -6376,13 +6812,13 @@
       </w:rPr>
     </w:lvl>
   </w:abstractNum>
-  <w:num w:numId="1">
+  <w:num w:numId="1" w16cid:durableId="185023059">
     <w:abstractNumId w:val="1"/>
   </w:num>
-  <w:num w:numId="2">
+  <w:num w:numId="2" w16cid:durableId="232467269">
     <w:abstractNumId w:val="2"/>
   </w:num>
-  <w:num w:numId="3">
+  <w:num w:numId="3" w16cid:durableId="1160930170">
     <w:abstractNumId w:val="0"/>
   </w:num>
   <w:numIdMacAtCleanup w:val="1"/>
@@ -6390,7 +6826,7 @@
 </file>
 
 <file path=word/styles.xml><?xml version="1.0" encoding="utf-8"?>
-<w:styles xmlns:mc="http://schemas.openxmlformats.org/markup-compatibility/2006" xmlns:r="http://schemas.openxmlformats.org/officeDocument/2006/relationships" xmlns:w="http://schemas.openxmlformats.org/wordprocessingml/2006/main" xmlns:w14="http://schemas.microsoft.com/office/word/2010/wordml" xmlns:w15="http://schemas.microsoft.com/office/word/2012/wordml" xmlns:w16cid="http://schemas.microsoft.com/office/word/2016/wordml/cid" xmlns:w16se="http://schemas.microsoft.com/office/word/2015/wordml/symex" mc:Ignorable="w14 w15 w16se w16cid">
+<w:styles xmlns:mc="http://schemas.openxmlformats.org/markup-compatibility/2006" xmlns:r="http://schemas.openxmlformats.org/officeDocument/2006/relationships" xmlns:w="http://schemas.openxmlformats.org/wordprocessingml/2006/main" xmlns:w14="http://schemas.microsoft.com/office/word/2010/wordml" xmlns:w15="http://schemas.microsoft.com/office/word/2012/wordml" xmlns:w16cex="http://schemas.microsoft.com/office/word/2018/wordml/cex" xmlns:w16cid="http://schemas.microsoft.com/office/word/2016/wordml/cid" xmlns:w16="http://schemas.microsoft.com/office/word/2018/wordml" xmlns:w16du="http://schemas.microsoft.com/office/word/2023/wordml/word16du" xmlns:w16sdtdh="http://schemas.microsoft.com/office/word/2020/wordml/sdtdatahash" xmlns:w16sdtfl="http://schemas.microsoft.com/office/word/2024/wordml/sdtformatlock" xmlns:w16se="http://schemas.microsoft.com/office/word/2015/wordml/symex" mc:Ignorable="w14 w15 w16se w16cid w16 w16cex w16sdtdh w16sdtfl w16du">
   <w:docDefaults>
     <w:rPrDefault>
       <w:rPr>
@@ -6408,7 +6844,7 @@
       </w:pPr>
     </w:pPrDefault>
   </w:docDefaults>
-  <w:latentStyles w:defLockedState="0" w:defUIPriority="99" w:defSemiHidden="0" w:defUnhideWhenUsed="0" w:defQFormat="0" w:count="375">
+  <w:latentStyles w:defLockedState="0" w:defUIPriority="99" w:defSemiHidden="0" w:defUnhideWhenUsed="0" w:defQFormat="0" w:count="376">
     <w:lsdException w:name="Normal" w:uiPriority="0" w:qFormat="1"/>
     <w:lsdException w:name="heading 1" w:uiPriority="9" w:qFormat="1"/>
     <w:lsdException w:name="heading 2" w:semiHidden="1" w:uiPriority="9" w:unhideWhenUsed="1" w:qFormat="1"/>
@@ -6784,6 +7220,7 @@
     <w:lsdException w:name="Smart Hyperlink" w:semiHidden="1" w:unhideWhenUsed="1"/>
     <w:lsdException w:name="Hashtag" w:semiHidden="1" w:unhideWhenUsed="1"/>
     <w:lsdException w:name="Unresolved Mention" w:semiHidden="1" w:unhideWhenUsed="1"/>
+    <w:lsdException w:name="Smart Link" w:semiHidden="1" w:unhideWhenUsed="1"/>
   </w:latentStyles>
   <w:style w:type="paragraph" w:default="1" w:styleId="Normal">
     <w:name w:val="Normal"/>
@@ -7004,7 +7441,6 @@
   <w:style w:type="character" w:default="1" w:styleId="Fuentedeprrafopredeter">
     <w:name w:val="Default Paragraph Font"/>
     <w:uiPriority w:val="1"/>
-    <w:semiHidden/>
     <w:unhideWhenUsed/>
   </w:style>
   <w:style w:type="table" w:default="1" w:styleId="Tablanormal">
@@ -7367,7 +7803,7 @@
       <w:rFonts w:asciiTheme="majorHAnsi" w:eastAsiaTheme="majorEastAsia" w:hAnsiTheme="majorHAnsi" w:cstheme="majorBidi"/>
     </w:rPr>
   </w:style>
-  <w:style w:type="character" w:styleId="Textoennegrita">
+  <w:style w:type="character" w:styleId="Fuerte">
     <w:name w:val="Strong"/>
     <w:basedOn w:val="Fuentedeprrafopredeter"/>
     <w:uiPriority w:val="22"/>
@@ -8798,6 +9234,15 @@
 </file>
 
 <file path=customXml/item2.xml><?xml version="1.0" encoding="utf-8"?>
+<?mso-contentType ?>
+<FormTemplates xmlns="http://schemas.microsoft.com/sharepoint/v3/contenttype/forms">
+  <Display>DocumentLibraryForm</Display>
+  <Edit>DocumentLibraryForm</Edit>
+  <New>DocumentLibraryForm</New>
+</FormTemplates>
+</file>
+
+<file path=customXml/item3.xml><?xml version="1.0" encoding="utf-8"?>
 <ct:contentTypeSchema xmlns:ct="http://schemas.microsoft.com/office/2006/metadata/contentType" xmlns:ma="http://schemas.microsoft.com/office/2006/metadata/properties/metaAttributes" ct:_="" ma:_="" ma:contentTypeName="Documento" ma:contentTypeID="0x010100FBEC16E57C49FB4C8FC2068EAA100277" ma:contentTypeVersion="29" ma:contentTypeDescription="Crear nuevo documento." ma:contentTypeScope="" ma:versionID="213e68402eea7ee67e92a7e85787514f">
   <xsd:schema xmlns:xsd="http://www.w3.org/2001/XMLSchema" xmlns:xs="http://www.w3.org/2001/XMLSchema" xmlns:p="http://schemas.microsoft.com/office/2006/metadata/properties" xmlns:ns2="f9d6f6a8-4c53-4eb2-bc43-5970dc157c21" xmlns:ns3="cde5a5e2-932b-4139-8354-a8de2ed6db86" targetNamespace="http://schemas.microsoft.com/office/2006/metadata/properties" ma:root="true" ma:fieldsID="cae16da778cf5b9ab526a32f8390a014" ns2:_="" ns3:_="">
     <xsd:import namespace="f9d6f6a8-4c53-4eb2-bc43-5970dc157c21"/>
@@ -9083,31 +9528,7 @@
 </ct:contentTypeSchema>
 </file>
 
-<file path=customXml/item3.xml><?xml version="1.0" encoding="utf-8"?>
-<?mso-contentType ?>
-<FormTemplates xmlns="http://schemas.microsoft.com/sharepoint/v3/contenttype/forms">
-  <Display>DocumentLibraryForm</Display>
-  <Edit>DocumentLibraryForm</Edit>
-  <New>DocumentLibraryForm</New>
-</FormTemplates>
-</file>
-
 <file path=customXml/item4.xml><?xml version="1.0" encoding="utf-8"?>
-<p:properties xmlns:p="http://schemas.microsoft.com/office/2006/metadata/properties" xmlns:xsi="http://www.w3.org/2001/XMLSchema-instance" xmlns:pc="http://schemas.microsoft.com/office/infopath/2007/PartnerControls">
-  <documentManagement>
-    <lcf76f155ced4ddcb4097134ff3c332f xmlns="f9d6f6a8-4c53-4eb2-bc43-5970dc157c21">
-      <Terms xmlns="http://schemas.microsoft.com/office/infopath/2007/PartnerControls"/>
-    </lcf76f155ced4ddcb4097134ff3c332f>
-    <Prueba xmlns="f9d6f6a8-4c53-4eb2-bc43-5970dc157c21" xsi:nil="true"/>
-    <Estado xmlns="f9d6f6a8-4c53-4eb2-bc43-5970dc157c21" xsi:nil="true"/>
-    <TaxCatchAll xmlns="cde5a5e2-932b-4139-8354-a8de2ed6db86" xsi:nil="true"/>
-    <Fecha_x0020__x00fa_ltimo_x0020_recurso xmlns="f9d6f6a8-4c53-4eb2-bc43-5970dc157c21" xsi:nil="true"/>
-    <_Flow_SignoffStatus xmlns="f9d6f6a8-4c53-4eb2-bc43-5970dc157c21" xsi:nil="true"/>
-  </documentManagement>
-</p:properties>
-</file>
-
-<file path=customXml/item5.xml><?xml version="1.0" encoding="utf-8"?>
 <b:Sources xmlns:b="http://schemas.openxmlformats.org/officeDocument/2006/bibliography" xmlns="http://schemas.openxmlformats.org/officeDocument/2006/bibliography" SelectedStyle="\APASixthEditionOfficeOnline.xsl" StyleName="APA" Version="6">
   <b:Source>
     <b:Tag>Pér95</b:Tag>
@@ -9334,6 +9755,21 @@
 </b:Sources>
 </file>
 
+<file path=customXml/item5.xml><?xml version="1.0" encoding="utf-8"?>
+<p:properties xmlns:p="http://schemas.microsoft.com/office/2006/metadata/properties" xmlns:xsi="http://www.w3.org/2001/XMLSchema-instance" xmlns:pc="http://schemas.microsoft.com/office/infopath/2007/PartnerControls">
+  <documentManagement>
+    <lcf76f155ced4ddcb4097134ff3c332f xmlns="f9d6f6a8-4c53-4eb2-bc43-5970dc157c21">
+      <Terms xmlns="http://schemas.microsoft.com/office/infopath/2007/PartnerControls"/>
+    </lcf76f155ced4ddcb4097134ff3c332f>
+    <Prueba xmlns="f9d6f6a8-4c53-4eb2-bc43-5970dc157c21" xsi:nil="true"/>
+    <Estado xmlns="f9d6f6a8-4c53-4eb2-bc43-5970dc157c21" xsi:nil="true"/>
+    <TaxCatchAll xmlns="cde5a5e2-932b-4139-8354-a8de2ed6db86" xsi:nil="true"/>
+    <Fecha_x0020__x00fa_ltimo_x0020_recurso xmlns="f9d6f6a8-4c53-4eb2-bc43-5970dc157c21" xsi:nil="true"/>
+    <_Flow_SignoffStatus xmlns="f9d6f6a8-4c53-4eb2-bc43-5970dc157c21" xsi:nil="true"/>
+  </documentManagement>
+</p:properties>
+</file>
+
 <file path=customXml/itemProps1.xml><?xml version="1.0" encoding="utf-8"?>
 <ds:datastoreItem xmlns:ds="http://schemas.openxmlformats.org/officeDocument/2006/customXml" ds:itemID="{55AF091B-3C7A-41E3-B477-F2FDAA23CFDA}">
   <ds:schemaRefs>
@@ -9343,6 +9779,14 @@
 </file>
 
 <file path=customXml/itemProps2.xml><?xml version="1.0" encoding="utf-8"?>
+<ds:datastoreItem xmlns:ds="http://schemas.openxmlformats.org/officeDocument/2006/customXml" ds:itemID="{7AE20836-165E-4F1C-BCD3-15D8D6C1D9BA}">
+  <ds:schemaRefs>
+    <ds:schemaRef ds:uri="http://schemas.microsoft.com/sharepoint/v3/contenttype/forms"/>
+  </ds:schemaRefs>
+</ds:datastoreItem>
+</file>
+
+<file path=customXml/itemProps3.xml><?xml version="1.0" encoding="utf-8"?>
 <ds:datastoreItem xmlns:ds="http://schemas.openxmlformats.org/officeDocument/2006/customXml" ds:itemID="{4B0B31D8-A0EF-4971-B122-1CE17CFFBBAE}">
   <ds:schemaRefs>
     <ds:schemaRef ds:uri="http://schemas.microsoft.com/office/2006/metadata/contentType"/>
@@ -9361,15 +9805,15 @@
 </ds:datastoreItem>
 </file>
 
-<file path=customXml/itemProps3.xml><?xml version="1.0" encoding="utf-8"?>
-<ds:datastoreItem xmlns:ds="http://schemas.openxmlformats.org/officeDocument/2006/customXml" ds:itemID="{7AE20836-165E-4F1C-BCD3-15D8D6C1D9BA}">
+<file path=customXml/itemProps4.xml><?xml version="1.0" encoding="utf-8"?>
+<ds:datastoreItem xmlns:ds="http://schemas.openxmlformats.org/officeDocument/2006/customXml" ds:itemID="{11B72324-2AB2-4CDE-AA9A-FB0555C10BBF}">
   <ds:schemaRefs>
-    <ds:schemaRef ds:uri="http://schemas.microsoft.com/sharepoint/v3/contenttype/forms"/>
+    <ds:schemaRef ds:uri="http://schemas.openxmlformats.org/officeDocument/2006/bibliography"/>
   </ds:schemaRefs>
 </ds:datastoreItem>
 </file>
 
-<file path=customXml/itemProps4.xml><?xml version="1.0" encoding="utf-8"?>
+<file path=customXml/itemProps5.xml><?xml version="1.0" encoding="utf-8"?>
 <ds:datastoreItem xmlns:ds="http://schemas.openxmlformats.org/officeDocument/2006/customXml" ds:itemID="{6593AE01-2D0B-457F-B235-F72C3C6C9419}">
   <ds:schemaRefs>
     <ds:schemaRef ds:uri="http://schemas.microsoft.com/office/2006/metadata/properties"/>
@@ -9378,12 +9822,4 @@
     <ds:schemaRef ds:uri="cde5a5e2-932b-4139-8354-a8de2ed6db86"/>
   </ds:schemaRefs>
 </ds:datastoreItem>
-</file>
-
-<file path=customXml/itemProps5.xml><?xml version="1.0" encoding="utf-8"?>
-<ds:datastoreItem xmlns:ds="http://schemas.openxmlformats.org/officeDocument/2006/customXml" ds:itemID="{11B72324-2AB2-4CDE-AA9A-FB0555C10BBF}">
-  <ds:schemaRefs>
-    <ds:schemaRef ds:uri="http://schemas.openxmlformats.org/officeDocument/2006/bibliography"/>
-  </ds:schemaRefs>
-</ds:datastoreItem>
 </file>
</xml_diff>